<commit_message>
Report: author block with names and registration numbers only
Removes the guide from the author list and drops the affiliation and
source-code lines under the names.

Co-Authored-By: Claude Opus 5.5 <noreply@anthropic.com>
</commit_message>
<xml_diff>
--- a/docs/report/OntoRisk_BI_IEEE_Report.docx
+++ b/docs/report/OntoRisk_BI_IEEE_Report.docx
@@ -16,56 +16,202 @@
         <w:t xml:space="preserve">OntoRisk BI: An Ontology-Driven Semantic Data Warehouse for Proactive Business Risk Intelligence</w:t>
       </w:r>
     </w:p>
-    <w:p>
-      <w:pPr>
-        <w:spacing w:after="40"/>
-        <w:jc w:val="center"/>
-      </w:pPr>
-      <w:r>
-        <w:rPr>
-          <w:rFonts w:ascii="Times New Roman" w:cs="Times New Roman" w:eastAsia="Times New Roman" w:hAnsi="Times New Roman"/>
-          <w:sz w:val="22"/>
-          <w:szCs w:val="22"/>
-        </w:rPr>
-        <w:t xml:space="preserve">Aishwarya Patil, Thiriveedhi Venkata Subba Sai Teja, Dhruv Naveen, Shaswat Das, and Sathiyaraj Rajendran</w:t>
-      </w:r>
-    </w:p>
-    <w:p>
-      <w:pPr>
-        <w:spacing w:after="0"/>
-        <w:jc w:val="center"/>
-      </w:pPr>
-      <w:r>
-        <w:rPr>
-          <w:rFonts w:ascii="Times New Roman" w:cs="Times New Roman" w:eastAsia="Times New Roman" w:hAnsi="Times New Roman"/>
-          <w:i/>
-          <w:iCs/>
-          <w:sz w:val="20"/>
-          <w:szCs w:val="20"/>
-        </w:rPr>
-        <w:t xml:space="preserve">Department of Computer Science and Engineering</w:t>
-      </w:r>
-    </w:p>
-    <w:p>
-      <w:pPr>
-        <w:spacing w:after="0"/>
-        <w:jc w:val="center"/>
-      </w:pPr>
-      <w:r>
-        <w:rPr>
-          <w:rFonts w:ascii="Times New Roman" w:cs="Times New Roman" w:eastAsia="Times New Roman" w:hAnsi="Times New Roman"/>
-          <w:i/>
-          <w:iCs/>
-          <w:sz w:val="20"/>
-          <w:szCs w:val="20"/>
-        </w:rPr>
-        <w:t xml:space="preserve">Manipal Institute of Technology Bengaluru, Manipal Academy of Higher Education, Manipal, India</w:t>
-      </w:r>
-    </w:p>
+    <w:tbl>
+      <w:tblPr>
+        <w:tblW w:type="dxa" w:w="10284"/>
+        <w:tblBorders>
+          <w:top w:val="single" w:color="auto" w:sz="4"/>
+          <w:left w:val="single" w:color="auto" w:sz="4"/>
+          <w:bottom w:val="single" w:color="auto" w:sz="4"/>
+          <w:right w:val="single" w:color="auto" w:sz="4"/>
+          <w:insideH w:val="single" w:color="auto" w:sz="4"/>
+          <w:insideV w:val="single" w:color="auto" w:sz="4"/>
+        </w:tblBorders>
+      </w:tblPr>
+      <w:tblGrid>
+        <w:gridCol w:w="2571"/>
+        <w:gridCol w:w="2571"/>
+        <w:gridCol w:w="2571"/>
+        <w:gridCol w:w="2571"/>
+      </w:tblGrid>
+      <w:tr>
+        <w:tc>
+          <w:tcPr>
+            <w:tcW w:type="dxa" w:w="2571"/>
+            <w:tcBorders>
+              <w:top w:val="none" w:color="FFFFFF" w:sz="0"/>
+              <w:left w:val="none" w:color="FFFFFF" w:sz="0"/>
+              <w:bottom w:val="none" w:color="FFFFFF" w:sz="0"/>
+              <w:right w:val="none" w:color="FFFFFF" w:sz="0"/>
+            </w:tcBorders>
+            <w:tcMar>
+              <w:left w:type="dxa" w:w="80"/>
+              <w:right w:type="dxa" w:w="80"/>
+            </w:tcMar>
+          </w:tcPr>
+          <w:p>
+            <w:pPr>
+              <w:jc w:val="center"/>
+            </w:pPr>
+            <w:r>
+              <w:rPr>
+                <w:rFonts w:ascii="Times New Roman" w:cs="Times New Roman" w:eastAsia="Times New Roman" w:hAnsi="Times New Roman"/>
+                <w:sz w:val="22"/>
+                <w:szCs w:val="22"/>
+              </w:rPr>
+              <w:t xml:space="preserve">Aishwarya Patil</w:t>
+            </w:r>
+          </w:p>
+          <w:p>
+            <w:pPr>
+              <w:jc w:val="center"/>
+            </w:pPr>
+            <w:r>
+              <w:rPr>
+                <w:rFonts w:ascii="Times New Roman" w:cs="Times New Roman" w:eastAsia="Times New Roman" w:hAnsi="Times New Roman"/>
+                <w:i/>
+                <w:iCs/>
+                <w:sz w:val="20"/>
+                <w:szCs w:val="20"/>
+              </w:rPr>
+              <w:t xml:space="preserve">Reg. No. 235890068</w:t>
+            </w:r>
+          </w:p>
+        </w:tc>
+        <w:tc>
+          <w:tcPr>
+            <w:tcW w:type="dxa" w:w="2571"/>
+            <w:tcBorders>
+              <w:top w:val="none" w:color="FFFFFF" w:sz="0"/>
+              <w:left w:val="none" w:color="FFFFFF" w:sz="0"/>
+              <w:bottom w:val="none" w:color="FFFFFF" w:sz="0"/>
+              <w:right w:val="none" w:color="FFFFFF" w:sz="0"/>
+            </w:tcBorders>
+            <w:tcMar>
+              <w:left w:type="dxa" w:w="80"/>
+              <w:right w:type="dxa" w:w="80"/>
+            </w:tcMar>
+          </w:tcPr>
+          <w:p>
+            <w:pPr>
+              <w:jc w:val="center"/>
+            </w:pPr>
+            <w:r>
+              <w:rPr>
+                <w:rFonts w:ascii="Times New Roman" w:cs="Times New Roman" w:eastAsia="Times New Roman" w:hAnsi="Times New Roman"/>
+                <w:sz w:val="22"/>
+                <w:szCs w:val="22"/>
+              </w:rPr>
+              <w:t xml:space="preserve">Thiriveedhi Venkata Subba Sai Teja</w:t>
+            </w:r>
+          </w:p>
+          <w:p>
+            <w:pPr>
+              <w:jc w:val="center"/>
+            </w:pPr>
+            <w:r>
+              <w:rPr>
+                <w:rFonts w:ascii="Times New Roman" w:cs="Times New Roman" w:eastAsia="Times New Roman" w:hAnsi="Times New Roman"/>
+                <w:i/>
+                <w:iCs/>
+                <w:sz w:val="20"/>
+                <w:szCs w:val="20"/>
+              </w:rPr>
+              <w:t xml:space="preserve">Reg. No. 235890021</w:t>
+            </w:r>
+          </w:p>
+        </w:tc>
+        <w:tc>
+          <w:tcPr>
+            <w:tcW w:type="dxa" w:w="2571"/>
+            <w:tcBorders>
+              <w:top w:val="none" w:color="FFFFFF" w:sz="0"/>
+              <w:left w:val="none" w:color="FFFFFF" w:sz="0"/>
+              <w:bottom w:val="none" w:color="FFFFFF" w:sz="0"/>
+              <w:right w:val="none" w:color="FFFFFF" w:sz="0"/>
+            </w:tcBorders>
+            <w:tcMar>
+              <w:left w:type="dxa" w:w="80"/>
+              <w:right w:type="dxa" w:w="80"/>
+            </w:tcMar>
+          </w:tcPr>
+          <w:p>
+            <w:pPr>
+              <w:jc w:val="center"/>
+            </w:pPr>
+            <w:r>
+              <w:rPr>
+                <w:rFonts w:ascii="Times New Roman" w:cs="Times New Roman" w:eastAsia="Times New Roman" w:hAnsi="Times New Roman"/>
+                <w:sz w:val="22"/>
+                <w:szCs w:val="22"/>
+              </w:rPr>
+              <w:t xml:space="preserve">Dhruv Naveen</w:t>
+            </w:r>
+          </w:p>
+          <w:p>
+            <w:pPr>
+              <w:jc w:val="center"/>
+            </w:pPr>
+            <w:r>
+              <w:rPr>
+                <w:rFonts w:ascii="Times New Roman" w:cs="Times New Roman" w:eastAsia="Times New Roman" w:hAnsi="Times New Roman"/>
+                <w:i/>
+                <w:iCs/>
+                <w:sz w:val="20"/>
+                <w:szCs w:val="20"/>
+              </w:rPr>
+              <w:t xml:space="preserve">Reg. No. 235890154</w:t>
+            </w:r>
+          </w:p>
+        </w:tc>
+        <w:tc>
+          <w:tcPr>
+            <w:tcW w:type="dxa" w:w="2571"/>
+            <w:tcBorders>
+              <w:top w:val="none" w:color="FFFFFF" w:sz="0"/>
+              <w:left w:val="none" w:color="FFFFFF" w:sz="0"/>
+              <w:bottom w:val="none" w:color="FFFFFF" w:sz="0"/>
+              <w:right w:val="none" w:color="FFFFFF" w:sz="0"/>
+            </w:tcBorders>
+            <w:tcMar>
+              <w:left w:type="dxa" w:w="80"/>
+              <w:right w:type="dxa" w:w="80"/>
+            </w:tcMar>
+          </w:tcPr>
+          <w:p>
+            <w:pPr>
+              <w:jc w:val="center"/>
+            </w:pPr>
+            <w:r>
+              <w:rPr>
+                <w:rFonts w:ascii="Times New Roman" w:cs="Times New Roman" w:eastAsia="Times New Roman" w:hAnsi="Times New Roman"/>
+                <w:sz w:val="22"/>
+                <w:szCs w:val="22"/>
+              </w:rPr>
+              <w:t xml:space="preserve">Shaswat Das</w:t>
+            </w:r>
+          </w:p>
+          <w:p>
+            <w:pPr>
+              <w:jc w:val="center"/>
+            </w:pPr>
+            <w:r>
+              <w:rPr>
+                <w:rFonts w:ascii="Times New Roman" w:cs="Times New Roman" w:eastAsia="Times New Roman" w:hAnsi="Times New Roman"/>
+                <w:i/>
+                <w:iCs/>
+                <w:sz w:val="20"/>
+                <w:szCs w:val="20"/>
+              </w:rPr>
+              <w:t xml:space="preserve">Reg. No. 235890222</w:t>
+            </w:r>
+          </w:p>
+        </w:tc>
+      </w:tr>
+    </w:tbl>
     <w:p>
       <w:pPr>
         <w:spacing w:after="280"/>
-        <w:jc w:val="center"/>
         <w:sectPr>
           <w:pgSz w:w="11906" w:h="16838" w:orient="portrait"/>
           <w:pgMar w:top="1077" w:right="811" w:bottom="1440" w:left="811" w:header="708" w:footer="708" w:gutter="0"/>
@@ -74,14 +220,6 @@
           <w:docGrid w:linePitch="360"/>
         </w:sectPr>
       </w:pPr>
-      <w:r>
-        <w:rPr>
-          <w:rFonts w:ascii="Times New Roman" w:cs="Times New Roman" w:eastAsia="Times New Roman" w:hAnsi="Times New Roman"/>
-          <w:sz w:val="18"/>
-          <w:szCs w:val="18"/>
-        </w:rPr>
-        <w:t xml:space="preserve">Source code: https://github.com/Ash6604/ontorisk-bi</w:t>
-      </w:r>
     </w:p>
     <w:p>
       <w:pPr>

</xml_diff>